<commit_message>
Revise §9/§10 tables for evidence-status consistency
Carry the declarative/done framing into the structured tables (the prior
revision had reached only the prose):
- §9 Validation Agenda: mark each rung's status (reached / reached for core / open).
- §10 Claims: move delivered evidence into "Current treatment"; rewrite
  "Required next evidence" to what is genuinely still open (independent host,
  cross-host durable comparison, production maturity); re-anchor the A2A/MCP
  row to the independent protocol surveys.

Recompiles clean (12 pp, 0 errors / 0 warnings). Mirrored in the .docx.

Co-Authored-By: Claude Opus 4.8 (1M context) <noreply@anthropic.com>
</commit_message>
<xml_diff>
--- a/OpenWOP_Scholarly_Paper_Manuscript_integrated.docx
+++ b/OpenWOP_Scholarly_Paper_Manuscript_integrated.docx
@@ -1435,13 +1435,8 @@
             <w:shd w:fill="D9EAF7"/>
           </w:tcPr>
           <w:p>
-            <w:r/>
             <w:r>
-              <w:rPr>
-                <w:b/>
-                <w:sz w:val="17"/>
-              </w:rPr>
-              <w:t>Stronger evidence</w:t>
+              <w:t>Stronger evidence (status this version)</w:t>
             </w:r>
           </w:p>
         </w:tc>
@@ -1485,13 +1480,8 @@
             <w:vAlign w:val="top"/>
           </w:tcPr>
           <w:p>
-            <w:r/>
             <w:r>
-              <w:rPr>
-                <w:b w:val="0"/>
-                <w:sz w:val="17"/>
-              </w:rPr>
-              <w:t>Runnable reference host with published commands and fixtures</w:t>
+              <w:t>Runnable reference host with published commands and fixtures — reached</w:t>
             </w:r>
           </w:p>
         </w:tc>
@@ -1535,13 +1525,8 @@
             <w:vAlign w:val="top"/>
           </w:tcPr>
           <w:p>
-            <w:r/>
             <w:r>
-              <w:rPr>
-                <w:b w:val="0"/>
-                <w:sz w:val="17"/>
-              </w:rPr>
-              <w:t>Replayable event log with schema validation</w:t>
+              <w:t>Replayable event log with schema validation — reached</w:t>
             </w:r>
           </w:p>
         </w:tc>
@@ -1569,12 +1554,7 @@
             <w:vAlign w:val="top"/>
           </w:tcPr>
           <w:p>
-            <w:r/>
             <w:r>
-              <w:rPr>
-                <w:b w:val="0"/>
-                <w:sz w:val="17"/>
-              </w:rPr>
               <w:t>Screenshot or transcript of pause/resume flow</w:t>
             </w:r>
           </w:p>
@@ -1585,13 +1565,8 @@
             <w:vAlign w:val="top"/>
           </w:tcPr>
           <w:p>
-            <w:r/>
             <w:r>
-              <w:rPr>
-                <w:b w:val="0"/>
-                <w:sz w:val="17"/>
-              </w:rPr>
-              <w:t>Automated test that verifies deterministic resume behavior</w:t>
+              <w:t>Automated suspend–resume capture on a durable host (incl. the 422 negative path) — reached</w:t>
             </w:r>
           </w:p>
         </w:tc>
@@ -1619,13 +1594,8 @@
             <w:vAlign w:val="top"/>
           </w:tcPr>
           <w:p>
-            <w:r/>
             <w:r>
-              <w:rPr>
-                <w:b w:val="0"/>
-                <w:sz w:val="17"/>
-              </w:rPr>
-              <w:t>Public leaderboard row and scenario results</w:t>
+              <w:t>Public leaderboard row and scenario results (reached)</w:t>
             </w:r>
           </w:p>
         </w:tc>
@@ -1635,13 +1605,8 @@
             <w:vAlign w:val="top"/>
           </w:tcPr>
           <w:p>
-            <w:r/>
             <w:r>
-              <w:rPr>
-                <w:b w:val="0"/>
-                <w:sz w:val="17"/>
-              </w:rPr>
-              <w:t>Independent host passing core profile scenarios</w:t>
+              <w:t>Independent host passing core profile scenarios — open</w:t>
             </w:r>
           </w:p>
         </w:tc>
@@ -1685,13 +1650,8 @@
             <w:vAlign w:val="top"/>
           </w:tcPr>
           <w:p>
-            <w:r/>
             <w:r>
-              <w:rPr>
-                <w:b w:val="0"/>
-                <w:sz w:val="17"/>
-              </w:rPr>
-              <w:t>Same workflow executed on two compliant hosts with equivalent artifacts</w:t>
+              <w:t>Same workflow on two language hosts; terminal state + event sequence equivalent (artifacts untested) — reached for core</w:t>
             </w:r>
           </w:p>
         </w:tc>
@@ -1735,13 +1695,8 @@
             <w:vAlign w:val="top"/>
           </w:tcPr>
           <w:p>
-            <w:r/>
             <w:r>
-              <w:rPr>
-                <w:b w:val="0"/>
-                <w:sz w:val="17"/>
-              </w:rPr>
-              <w:t>Before/after code or adapter-count comparison</w:t>
+              <w:t>Before/after code or adapter-count comparison — open</w:t>
             </w:r>
           </w:p>
         </w:tc>
@@ -1909,13 +1864,8 @@
             <w:vAlign w:val="top"/>
           </w:tcPr>
           <w:p>
-            <w:r/>
             <w:r>
-              <w:rPr>
-                <w:b w:val="0"/>
-                <w:sz w:val="17"/>
-              </w:rPr>
-              <w:t>Keep secondary; cite comparison document</w:t>
+              <w:t>Keep secondary; cite the independent protocol surveys [31, 32]</w:t>
             </w:r>
           </w:p>
         </w:tc>
@@ -1944,7 +1894,7 @@
           </w:tcPr>
           <w:p>
             <w:r>
-              <w:t>Reference-implementation- and run-capture-supported</w:t>
+              <w:t>Reference-implementation- and run-capture-supported: captured HostCapabilityDocument, conformance snapshot, and reference- plus durable-host run logs</w:t>
             </w:r>
           </w:p>
         </w:tc>
@@ -1955,7 +1905,7 @@
           </w:tcPr>
           <w:p>
             <w:r>
-              <w:t>Captured live HostCapabilityDocument, conformance snapshot, and a real reference-host run-event log</w:t>
+              <w:t>Independent (non-steward) deployment; production maturity</w:t>
             </w:r>
           </w:p>
         </w:tc>
@@ -1983,13 +1933,8 @@
             <w:vAlign w:val="top"/>
           </w:tcPr>
           <w:p>
-            <w:r/>
             <w:r>
-              <w:rPr>
-                <w:b w:val="0"/>
-                <w:sz w:val="17"/>
-              </w:rPr>
-              <w:t>Conformance-page-supported claim</w:t>
+              <w:t>Conformance-snapshot-supported: host rows, profiles, suite version, and pass rates captured</w:t>
             </w:r>
           </w:p>
         </w:tc>
@@ -1999,13 +1944,8 @@
             <w:vAlign w:val="top"/>
           </w:tcPr>
           <w:p>
-            <w:r/>
             <w:r>
-              <w:rPr>
-                <w:b w:val="0"/>
-                <w:sz w:val="17"/>
-              </w:rPr>
-              <w:t>Add snapshot of host row, profile, scenario results</w:t>
+              <w:t>An independent host passing the core profile</w:t>
             </w:r>
           </w:p>
         </w:tc>
@@ -2034,7 +1974,7 @@
           </w:tcPr>
           <w:p>
             <w:r>
-              <w:t>Demonstrated for core workflows across two language implementations (Cell A)</w:t>
+              <w:t>Demonstrated for core workflows across two language hosts; durable-host interrupt/resume captured (Cell A)</w:t>
             </w:r>
           </w:p>
         </w:tc>
@@ -2045,7 +1985,7 @@
           </w:tcPr>
           <w:p>
             <w:r>
-              <w:t>Extend to interrupt/replay (Cell B, durable hosts) and to an independent non-steward host</w:t>
+              <w:t>Cross-host durable comparison (a second durable host) and an independent non-steward host</w:t>
             </w:r>
           </w:p>
         </w:tc>

</xml_diff>

<commit_message>
Apply independent-review fixes + correct float placement
- Float placement: [!htbp] -> [H] (float pkg) so tables/figures sit inline with
  their sections (the prior [!htbp] caused gap-splits, an orphaned heading, and a
  lone float page).
- Title: "OpenWOP: A Vendor-Neutral Protocol for Durable, Portable Agentic
  Workflow Orchestration" (sharper).
- Intro: foreground the Run abstraction in paragraph 1; soften the thesis from
  "accelerate" to "plausibly reduce orchestration-layer friction".
- Evidence table (Sec 7): add the cross-language portability + durable-host
  interrupt/resume rows (the headline evidence); refresh a stale cell.
- Reproducibility: move before the Conclusion as a compact "Artifact
  Availability" section (Sec 12); Conclusion is now Sec 13.

Recompiles clean (12 pp, 0 errors / 0 warnings). Mirrored in the .docx.

Co-Authored-By: Claude Opus 4.8 (1M context) <noreply@anthropic.com>
</commit_message>
<xml_diff>
--- a/OpenWOP_Scholarly_Paper_Manuscript_integrated.docx
+++ b/OpenWOP_Scholarly_Paper_Manuscript_integrated.docx
@@ -7,7 +7,7 @@
         <w:jc w:val="center"/>
       </w:pPr>
       <w:r>
-        <w:t>OpenWOP as a Vendor-Neutral Workflow Orchestration Protocol</w:t>
+        <w:t>OpenWOP: A Vendor-Neutral Protocol for Durable, Portable Agentic Workflow Orchestration</w:t>
       </w:r>
     </w:p>
     <w:p>
@@ -38,12 +38,12 @@
     </w:p>
     <w:p>
       <w:r>
-        <w:t>Agentic software systems are moving beyond isolated tool calls or single-agent sessions. They increasingly coordinate multiple agents, external tools, human approvals, policy checks, artifact generation, event streams, and long-running execution. This creates an orchestration-layer problem: teams need workflows that can be started, observed, interrupted, resumed, replayed, audited, and moved across systems without binding the workflow semantics to a single vendor or runtime.</w:t>
+        <w:t>Agentic software systems are moving beyond isolated tool calls or single-agent sessions. They increasingly coordinate multiple agents, external tools, human approvals, policy checks, artifact generation, event streams, and long-running execution. This creates an orchestration-layer problem: teams need workflows that can be started, observed, interrupted, resumed, replayed, audited, and moved across systems without binding the workflow semantics to a single vendor or runtime. The key abstraction is the workflow Run: a durable execution instance whose lifecycle, event history, interrupts, artifacts, replay behavior, and conformance evidence can be observed across compliant hosts.</w:t>
       </w:r>
     </w:p>
     <w:p>
       <w:r>
-        <w:t>The central thesis of this paper is that a vendor-neutral open protocol for multi-agent workflow orchestration can accelerate intelligent software development by standardizing workflow communication, reducing integration complexity, and enabling portability across tools, systems, and organizational boundaries. This should be read as a scholarly argument and research hypothesis, not as a fully established empirical claim. The paper therefore distinguishes protocol-level claims from adoption and productivity claims that require further study.</w:t>
+        <w:t>The central thesis of this paper is that a vendor-neutral open protocol for multi-agent workflow orchestration can plausibly reduce orchestration-layer friction in intelligent software development by standardizing workflow communication, reducing integration complexity, and enabling portability across tools, systems, and organizational boundaries. This should be read as a scholarly argument and research hypothesis, not as a fully established empirical claim. The paper therefore distinguishes protocol-level claims from adoption and productivity claims that require further study.</w:t>
       </w:r>
     </w:p>
     <w:p>
@@ -1148,13 +1148,8 @@
             <w:vAlign w:val="top"/>
           </w:tcPr>
           <w:p>
-            <w:r/>
             <w:r>
-              <w:rPr>
-                <w:b w:val="0"/>
-                <w:sz w:val="17"/>
-              </w:rPr>
-              <w:t>workflow-engine reference/demo app</w:t>
+              <w:t>Workflow-engine reference/demo app</w:t>
             </w:r>
           </w:p>
         </w:tc>
@@ -1180,13 +1175,8 @@
             <w:vAlign w:val="top"/>
           </w:tcPr>
           <w:p>
-            <w:r/>
             <w:r>
-              <w:rPr>
-                <w:b w:val="0"/>
-                <w:sz w:val="17"/>
-              </w:rPr>
-              <w:t>Cross-host portability or production deployment maturity</w:t>
+              <w:t>Production-deployment maturity or broad adoption</w:t>
             </w:r>
           </w:p>
         </w:tc>
@@ -1237,6 +1227,70 @@
                 <w:sz w:val="17"/>
               </w:rPr>
               <w:t>Universal conformance, ecosystem-wide adoption, or long-term stability</w:t>
+            </w:r>
+          </w:p>
+        </w:tc>
+      </w:tr>
+      <w:tr>
+        <w:tc>
+          <w:tcPr>
+            <w:tcW w:type="dxa" w:w="3360"/>
+          </w:tcPr>
+          <w:p>
+            <w:r>
+              <w:t>TypeScript + Python host result</w:t>
+            </w:r>
+          </w:p>
+        </w:tc>
+        <w:tc>
+          <w:tcPr>
+            <w:tcW w:type="dxa" w:w="3360"/>
+          </w:tcPr>
+          <w:p>
+            <w:r>
+              <w:t>Cross-language core portability (identical terminal state + event-log structure)</w:t>
+            </w:r>
+          </w:p>
+        </w:tc>
+        <w:tc>
+          <w:tcPr>
+            <w:tcW w:type="dxa" w:w="3360"/>
+          </w:tcPr>
+          <w:p>
+            <w:r>
+              <w:t>Third-party (non-steward) portability</w:t>
+            </w:r>
+          </w:p>
+        </w:tc>
+      </w:tr>
+      <w:tr>
+        <w:tc>
+          <w:tcPr>
+            <w:tcW w:type="dxa" w:w="3360"/>
+          </w:tcPr>
+          <w:p>
+            <w:r>
+              <w:t>Interrupt/resume capture (durable host)</w:t>
+            </w:r>
+          </w:p>
+        </w:tc>
+        <w:tc>
+          <w:tcPr>
+            <w:tcW w:type="dxa" w:w="3360"/>
+          </w:tcPr>
+          <w:p>
+            <w:r>
+              <w:t>HITL lifecycle implementability (suspend, correlation-validated resume, replay-debug)</w:t>
+            </w:r>
+          </w:p>
+        </w:tc>
+        <w:tc>
+          <w:tcPr>
+            <w:tcW w:type="dxa" w:w="3360"/>
+          </w:tcPr>
+          <w:p>
+            <w:r>
+              <w:t>General workflow coverage</w:t>
             </w:r>
           </w:p>
         </w:tc>
@@ -2114,7 +2168,20 @@
         <w:pStyle w:val="Heading1"/>
       </w:pPr>
       <w:r>
-        <w:t>12. Conclusion</w:t>
+        <w:t>12. Reproducibility and Artifact Availability</w:t>
+      </w:r>
+    </w:p>
+    <w:p>
+      <w:r>
+        <w:t>An evidence artifact accompanies this paper: the captured live HostCapabilityDocument; a conformance-leaderboard snapshot (host rows, profiles, suite version, pass rates); a reference-host run-event log and a durable-host interrupt/resume plus replay-debug capture; the raw cross-host portability captures and experiment design (3/3 core workflows yield identical terminal state and event-log structure across an independent TypeScript and Python host, plus a capability-rejection divergence finding); host-setup instructions; and the 40-entry bibliography verified against authoritative sources. Two items remain open: independent external-reviewer feedback (a reviewer packet is prepared), and a cross-host durable portability comparison plus deterministic fork-from-checkpoint replay.</w:t>
+      </w:r>
+    </w:p>
+    <w:p>
+      <w:pPr>
+        <w:pStyle w:val="Heading1"/>
+      </w:pPr>
+      <w:r>
+        <w:t>13. Conclusion</w:t>
       </w:r>
     </w:p>
     <w:p>
@@ -2122,350 +2189,6 @@
         <w:t>A vendor-neutral workflow orchestration protocol is a plausible infrastructure mechanism for reducing fragmentation in agentic software systems. OpenWOP should be evaluated as a protocol for durable workflow runs, not as a replacement for agent-to-agent collaboration, tool/context integration, or workflow runtimes. Its strongest scholarly contribution is the combination of a run-centered protocol kernel, observable event logs, human checkpoint semantics, replay/debug support, host capability discovery, and conformance evidence. This manuscript converts the earlier conceptual argument into an artifact-backed submission: demo and interrupt transcripts, a conformance snapshot, and a cross-host portability experiment accompany it. The decisive next evidence is a non-steward host and independent external review.</w:t>
       </w:r>
     </w:p>
-    <w:p>
-      <w:pPr>
-        <w:pStyle w:val="Heading1"/>
-      </w:pPr>
-      <w:r>
-        <w:t>13. Reproducibility and Artifact Status</w:t>
-      </w:r>
-    </w:p>
-    <w:p>
-      <w:r>
-        <w:t>The items that earlier drafts listed as immediate next steps have been carried out; the accompanying evidence artifact records the results, so they are reported here as status rather than as pending work.</w:t>
-      </w:r>
-    </w:p>
-    <w:tbl>
-      <w:tblPr>
-        <w:tblStyle w:val="TableGrid"/>
-        <w:tblW w:type="auto" w:w="0"/>
-        <w:jc w:val="center"/>
-        <w:tblLook w:firstColumn="1" w:firstRow="1" w:lastColumn="0" w:lastRow="0" w:noHBand="0" w:noVBand="1" w:val="04A0"/>
-      </w:tblPr>
-      <w:tblGrid>
-        <w:gridCol w:w="3360"/>
-        <w:gridCol w:w="3360"/>
-        <w:gridCol w:w="3360"/>
-      </w:tblGrid>
-      <w:tr>
-        <w:tc>
-          <w:tcPr>
-            <w:tcW w:type="dxa" w:w="720"/>
-            <w:vAlign w:val="top"/>
-            <w:shd w:fill="D9EAF7"/>
-          </w:tcPr>
-          <w:p>
-            <w:r>
-              <w:t>Item</w:t>
-            </w:r>
-          </w:p>
-        </w:tc>
-        <w:tc>
-          <w:tcPr>
-            <w:tcW w:type="dxa" w:w="3888"/>
-            <w:vAlign w:val="top"/>
-            <w:shd w:fill="D9EAF7"/>
-          </w:tcPr>
-          <w:p>
-            <w:r>
-              <w:t>Status</w:t>
-            </w:r>
-          </w:p>
-        </w:tc>
-        <w:tc>
-          <w:tcPr>
-            <w:tcW w:type="dxa" w:w="5472"/>
-            <w:vAlign w:val="top"/>
-            <w:shd w:fill="D9EAF7"/>
-          </w:tcPr>
-          <w:p>
-            <w:r>
-              <w:t>Artifact</w:t>
-            </w:r>
-          </w:p>
-        </w:tc>
-      </w:tr>
-      <w:tr>
-        <w:tc>
-          <w:tcPr>
-            <w:tcW w:type="dxa" w:w="720"/>
-            <w:vAlign w:val="top"/>
-          </w:tcPr>
-          <w:p>
-            <w:r>
-              <w:t>Demo / run-lifecycle evidence</w:t>
-            </w:r>
-          </w:p>
-        </w:tc>
-        <w:tc>
-          <w:tcPr>
-            <w:tcW w:type="dxa" w:w="3888"/>
-            <w:vAlign w:val="top"/>
-          </w:tcPr>
-          <w:p>
-            <w:r>
-              <w:t>Done - reference-host run-event log, live HostCapabilityDocument, and (on a durable host) the full interrupt/resume lifecycle (suspend -&gt; signed-token correlation-validated external resume -&gt; run.completed, incl. the 422 mismatch path) plus the replay/debug bundle. Deterministic fork-from-checkpoint replay remains future work.</w:t>
-            </w:r>
-          </w:p>
-        </w:tc>
-        <w:tc>
-          <w:tcPr>
-            <w:tcW w:type="dxa" w:w="5472"/>
-            <w:vAlign w:val="top"/>
-          </w:tcPr>
-          <w:p>
-            <w:r>
-              <w:t>evidence/demo-app/observed-run.json; observed-interrupt-run.json; interrupt-replay.md; evidence/portability/results.md</w:t>
-            </w:r>
-          </w:p>
-        </w:tc>
-      </w:tr>
-      <w:tr>
-        <w:tc>
-          <w:tcPr>
-            <w:tcW w:type="dxa" w:w="720"/>
-            <w:vAlign w:val="top"/>
-          </w:tcPr>
-          <w:p>
-            <w:r>
-              <w:t>Conformance snapshot</w:t>
-            </w:r>
-          </w:p>
-        </w:tc>
-        <w:tc>
-          <w:tcPr>
-            <w:tcW w:type="dxa" w:w="3888"/>
-            <w:vAlign w:val="top"/>
-          </w:tcPr>
-          <w:p>
-            <w:r>
-              <w:t>Done - host rows, profiles, suite version, pass rates.</w:t>
-            </w:r>
-          </w:p>
-        </w:tc>
-        <w:tc>
-          <w:tcPr>
-            <w:tcW w:type="dxa" w:w="5472"/>
-            <w:vAlign w:val="top"/>
-          </w:tcPr>
-          <w:p>
-            <w:r>
-              <w:t>evidence/conformance/conformance-snapshot.md</w:t>
-            </w:r>
-          </w:p>
-        </w:tc>
-      </w:tr>
-      <w:tr>
-        <w:tc>
-          <w:tcPr>
-            <w:tcW w:type="dxa" w:w="720"/>
-            <w:vAlign w:val="top"/>
-          </w:tcPr>
-          <w:p>
-            <w:r>
-              <w:t>Workflow-engine setup path</w:t>
-            </w:r>
-          </w:p>
-        </w:tc>
-        <w:tc>
-          <w:tcPr>
-            <w:tcW w:type="dxa" w:w="3888"/>
-            <w:vAlign w:val="top"/>
-          </w:tcPr>
-          <w:p>
-            <w:r>
-              <w:t>Done - run commands, repo paths, known limitations.</w:t>
-            </w:r>
-          </w:p>
-        </w:tc>
-        <w:tc>
-          <w:tcPr>
-            <w:tcW w:type="dxa" w:w="5472"/>
-            <w:vAlign w:val="top"/>
-          </w:tcPr>
-          <w:p>
-            <w:r>
-              <w:t>evidence/demo-app/host-setup.md</w:t>
-            </w:r>
-          </w:p>
-        </w:tc>
-      </w:tr>
-      <w:tr>
-        <w:tc>
-          <w:tcPr>
-            <w:tcW w:type="dxa" w:w="720"/>
-            <w:vAlign w:val="top"/>
-          </w:tcPr>
-          <w:p>
-            <w:r>
-              <w:t>Artifact package + README</w:t>
-            </w:r>
-          </w:p>
-        </w:tc>
-        <w:tc>
-          <w:tcPr>
-            <w:tcW w:type="dxa" w:w="3888"/>
-            <w:vAlign w:val="top"/>
-          </w:tcPr>
-          <w:p>
-            <w:r>
-              <w:t>Done - reviewer-facing README + evidence tree.</w:t>
-            </w:r>
-          </w:p>
-        </w:tc>
-        <w:tc>
-          <w:tcPr>
-            <w:tcW w:type="dxa" w:w="5472"/>
-            <w:vAlign w:val="top"/>
-          </w:tcPr>
-          <w:p>
-            <w:r>
-              <w:t>README.md</w:t>
-            </w:r>
-          </w:p>
-        </w:tc>
-      </w:tr>
-      <w:tr>
-        <w:tc>
-          <w:tcPr>
-            <w:tcW w:type="dxa" w:w="720"/>
-            <w:vAlign w:val="top"/>
-          </w:tcPr>
-          <w:p>
-            <w:r>
-              <w:t>References normalized</w:t>
-            </w:r>
-          </w:p>
-        </w:tc>
-        <w:tc>
-          <w:tcPr>
-            <w:tcW w:type="dxa" w:w="3888"/>
-            <w:vAlign w:val="top"/>
-          </w:tcPr>
-          <w:p>
-            <w:r>
-              <w:t>Done - 40-entry bibliography, each verified against its authoritative source.</w:t>
-            </w:r>
-          </w:p>
-        </w:tc>
-        <w:tc>
-          <w:tcPr>
-            <w:tcW w:type="dxa" w:w="5472"/>
-            <w:vAlign w:val="top"/>
-          </w:tcPr>
-          <w:p>
-            <w:r>
-              <w:t>references.md</w:t>
-            </w:r>
-          </w:p>
-        </w:tc>
-      </w:tr>
-      <w:tr>
-        <w:tc>
-          <w:tcPr>
-            <w:tcW w:type="dxa" w:w="720"/>
-            <w:vAlign w:val="top"/>
-          </w:tcPr>
-          <w:p>
-            <w:r>
-              <w:t>Cross-host portability</w:t>
-            </w:r>
-          </w:p>
-        </w:tc>
-        <w:tc>
-          <w:tcPr>
-            <w:tcW w:type="dxa" w:w="3888"/>
-            <w:vAlign w:val="top"/>
-          </w:tcPr>
-          <w:p>
-            <w:r>
-              <w:t>Done (core) - same workflow definition -&gt; identical terminal state + event-log structure across an independent TypeScript and Python host (3/3 core workflows) + a divergence finding.</w:t>
-            </w:r>
-          </w:p>
-        </w:tc>
-        <w:tc>
-          <w:tcPr>
-            <w:tcW w:type="dxa" w:w="5472"/>
-            <w:vAlign w:val="top"/>
-          </w:tcPr>
-          <w:p>
-            <w:r>
-              <w:t>evidence/portability/results.md</w:t>
-            </w:r>
-          </w:p>
-        </w:tc>
-      </w:tr>
-      <w:tr>
-        <w:tc>
-          <w:tcPr>
-            <w:tcW w:type="dxa" w:w="720"/>
-            <w:vAlign w:val="top"/>
-          </w:tcPr>
-          <w:p>
-            <w:r>
-              <w:t>External review</w:t>
-            </w:r>
-          </w:p>
-        </w:tc>
-        <w:tc>
-          <w:tcPr>
-            <w:tcW w:type="dxa" w:w="3888"/>
-            <w:vAlign w:val="top"/>
-          </w:tcPr>
-          <w:p>
-            <w:r>
-              <w:t>Reviewer packet prepared; feedback pending (requires external participants).</w:t>
-            </w:r>
-          </w:p>
-        </w:tc>
-        <w:tc>
-          <w:tcPr>
-            <w:tcW w:type="dxa" w:w="5472"/>
-            <w:vAlign w:val="top"/>
-          </w:tcPr>
-          <w:p>
-            <w:r>
-              <w:t>review/review-guide.md</w:t>
-            </w:r>
-          </w:p>
-        </w:tc>
-      </w:tr>
-      <w:tr>
-        <w:tc>
-          <w:tcPr>
-            <w:tcW w:type="dxa" w:w="720"/>
-            <w:vAlign w:val="top"/>
-          </w:tcPr>
-          <w:p>
-            <w:r>
-              <w:t>Venue package</w:t>
-            </w:r>
-          </w:p>
-        </w:tc>
-        <w:tc>
-          <w:tcPr>
-            <w:tcW w:type="dxa" w:w="3888"/>
-            <w:vAlign w:val="top"/>
-          </w:tcPr>
-          <w:p>
-            <w:r>
-              <w:t>Done - arXiv source (12-page PDF), Word manuscript, artifact archive, cover note, arXiv metadata. Shorter workshop version deferred to a workshop venue's template (arXiv has no page limit).</w:t>
-            </w:r>
-          </w:p>
-        </w:tc>
-        <w:tc>
-          <w:tcPr>
-            <w:tcW w:type="dxa" w:w="5472"/>
-            <w:vAlign w:val="top"/>
-          </w:tcPr>
-          <w:p>
-            <w:r>
-              <w:t>arxiv/ (main.tex, cover-note.md, arxiv-submission.md)</w:t>
-            </w:r>
-          </w:p>
-        </w:tc>
-      </w:tr>
-    </w:tbl>
     <w:p>
       <w:pPr>
         <w:pStyle w:val="Heading1"/>

</xml_diff>